<commit_message>
fixed the doc file
</commit_message>
<xml_diff>
--- a/D602/Task 1/D602_task1.docx
+++ b/D602/Task 1/D602_task1.docx
@@ -72,35 +72,21 @@
           <w:rFonts w:ascii="Times New Roman" w:hAnsi="Times New Roman" w:cs="Times New Roman"/>
         </w:rPr>
         <w:tab/>
-        <w:t xml:space="preserve">The primary goal for the </w:t>
+        <w:t xml:space="preserve">The primary goal for the MLOps deployment architecture is to modernize </w:t>
       </w:r>
       <w:proofErr w:type="spellStart"/>
       <w:r>
         <w:rPr>
           <w:rFonts w:ascii="Times New Roman" w:hAnsi="Times New Roman" w:cs="Times New Roman"/>
         </w:rPr>
-        <w:t>MLOps</w:t>
+        <w:t>Kronker’s</w:t>
       </w:r>
       <w:proofErr w:type="spellEnd"/>
       <w:r>
         <w:rPr>
           <w:rFonts w:ascii="Times New Roman" w:hAnsi="Times New Roman" w:cs="Times New Roman"/>
         </w:rPr>
-        <w:t xml:space="preserve"> deployment architecture is to modernize </w:t>
-      </w:r>
-      <w:proofErr w:type="spellStart"/>
-      <w:r>
-        <w:rPr>
-          <w:rFonts w:ascii="Times New Roman" w:hAnsi="Times New Roman" w:cs="Times New Roman"/>
-        </w:rPr>
-        <w:t>Kronker’s</w:t>
-      </w:r>
-      <w:proofErr w:type="spellEnd"/>
-      <w:r>
-        <w:rPr>
-          <w:rFonts w:ascii="Times New Roman" w:hAnsi="Times New Roman" w:cs="Times New Roman"/>
-        </w:rPr>
-        <w:t xml:space="preserve"> data operations to support its growth and competitive strategy. Here I will list some of the objectives that are crucial and I will give a little more information. </w:t>
+        <w:t xml:space="preserve"> data operations to support its growth and competitive strategy. Here I will list some of the objectives that are crucial and I will give a little more information.</w:t>
       </w:r>
     </w:p>
     <w:p>
@@ -108,7 +94,7 @@
         <w:pStyle w:val="ListParagraph"/>
         <w:numPr>
           <w:ilvl w:val="0"/>
-          <w:numId w:val="1"/>
+          <w:numId w:val="5"/>
         </w:numPr>
         <w:rPr>
           <w:rFonts w:ascii="Times New Roman" w:hAnsi="Times New Roman" w:cs="Times New Roman"/>
@@ -118,7 +104,31 @@
         <w:rPr>
           <w:rFonts w:ascii="Times New Roman" w:hAnsi="Times New Roman" w:cs="Times New Roman"/>
         </w:rPr>
-        <w:t xml:space="preserve">Standardized and Centralize Model Management: The architecture must unify the workflows of data analysts who are currently working across the Marketing and Procurement teams. This will aim to replace the current ad-hoc storage on shared OneDrive folders and individual laptops with centralized repository for code, artifacts, and datasets. </w:t>
+        <w:t>Centralize and Standardize Model storage and Deployment</w:t>
+      </w:r>
+    </w:p>
+    <w:p>
+      <w:pPr>
+        <w:pStyle w:val="ListParagraph"/>
+        <w:numPr>
+          <w:ilvl w:val="1"/>
+          <w:numId w:val="5"/>
+        </w:numPr>
+        <w:rPr>
+          <w:rFonts w:ascii="Times New Roman" w:hAnsi="Times New Roman" w:cs="Times New Roman"/>
+        </w:rPr>
+      </w:pPr>
+      <w:r>
+        <w:rPr>
+          <w:rFonts w:ascii="Times New Roman" w:hAnsi="Times New Roman" w:cs="Times New Roman"/>
+        </w:rPr>
+        <w:t>Justification: Right now, analyst that are currently working across teams are storing all the analysis in a shared OneDrive space, and deployment varies drastically from each individual computer. By implementing MLOps architecture</w:t>
+      </w:r>
+      <w:r>
+        <w:rPr>
+          <w:rFonts w:ascii="Times New Roman" w:hAnsi="Times New Roman" w:cs="Times New Roman"/>
+        </w:rPr>
+        <w:t xml:space="preserve">, this will provide a dedicated method to the team to store code, model artifacts, and datasets securely all in one place. </w:t>
       </w:r>
     </w:p>
     <w:p>
@@ -126,7 +136,7 @@
         <w:pStyle w:val="ListParagraph"/>
         <w:numPr>
           <w:ilvl w:val="0"/>
-          <w:numId w:val="1"/>
+          <w:numId w:val="5"/>
         </w:numPr>
         <w:rPr>
           <w:rFonts w:ascii="Times New Roman" w:hAnsi="Times New Roman" w:cs="Times New Roman"/>
@@ -136,31 +146,76 @@
         <w:rPr>
           <w:rFonts w:ascii="Times New Roman" w:hAnsi="Times New Roman" w:cs="Times New Roman"/>
         </w:rPr>
-        <w:t>Enable Multi-Language Interoperability: The system must support a diverse technical environment, accommodating models written in Python</w:t>
-      </w:r>
-      <w:r>
-        <w:rPr>
-          <w:rFonts w:ascii="Times New Roman" w:hAnsi="Times New Roman" w:cs="Times New Roman"/>
-        </w:rPr>
-        <w:t xml:space="preserve">, </w:t>
-      </w:r>
-      <w:r>
-        <w:rPr>
-          <w:rFonts w:ascii="Times New Roman" w:hAnsi="Times New Roman" w:cs="Times New Roman"/>
-        </w:rPr>
-        <w:t>R</w:t>
-      </w:r>
-      <w:r>
-        <w:rPr>
-          <w:rFonts w:ascii="Times New Roman" w:hAnsi="Times New Roman" w:cs="Times New Roman"/>
-        </w:rPr>
-        <w:t>, and Julia</w:t>
-      </w:r>
-      <w:r>
-        <w:rPr>
-          <w:rFonts w:ascii="Times New Roman" w:hAnsi="Times New Roman" w:cs="Times New Roman"/>
-        </w:rPr>
-        <w:t xml:space="preserve">. This will ensure that the organization can leverage the specific strength of different languages without being hindered by compatibility issues. </w:t>
+        <w:t>Automate Model Training and Prediction Pipeline</w:t>
+      </w:r>
+    </w:p>
+    <w:p>
+      <w:pPr>
+        <w:pStyle w:val="ListParagraph"/>
+        <w:numPr>
+          <w:ilvl w:val="1"/>
+          <w:numId w:val="5"/>
+        </w:numPr>
+        <w:rPr>
+          <w:rFonts w:ascii="Times New Roman" w:hAnsi="Times New Roman" w:cs="Times New Roman"/>
+        </w:rPr>
+      </w:pPr>
+      <w:r>
+        <w:rPr>
+          <w:rFonts w:ascii="Times New Roman" w:hAnsi="Times New Roman" w:cs="Times New Roman"/>
+        </w:rPr>
+        <w:t xml:space="preserve">Justification: </w:t>
+      </w:r>
+      <w:r>
+        <w:rPr>
+          <w:rFonts w:ascii="Times New Roman" w:hAnsi="Times New Roman" w:cs="Times New Roman"/>
+        </w:rPr>
+        <w:t xml:space="preserve">From the file it looks like right now that the </w:t>
+      </w:r>
+      <w:r>
+        <w:rPr>
+          <w:rFonts w:ascii="Times New Roman" w:hAnsi="Times New Roman" w:cs="Times New Roman"/>
+        </w:rPr>
+        <w:t>shift</w:t>
+      </w:r>
+      <w:r>
+        <w:rPr>
+          <w:rFonts w:ascii="Times New Roman" w:hAnsi="Times New Roman" w:cs="Times New Roman"/>
+        </w:rPr>
+        <w:t xml:space="preserve"> in customers’ demands or other model parameters are currently entered manually into the code or imported as text files. </w:t>
+      </w:r>
+      <w:r>
+        <w:rPr>
+          <w:rFonts w:ascii="Times New Roman" w:hAnsi="Times New Roman" w:cs="Times New Roman"/>
+        </w:rPr>
+        <w:t xml:space="preserve">By introducing a MLOps solution it will help automate and enhance operations by replacing these manual, error prone inputs with automated deployment methods accessible to various departments. </w:t>
+      </w:r>
+    </w:p>
+    <w:p>
+      <w:pPr>
+        <w:rPr>
+          <w:rFonts w:ascii="Times New Roman" w:hAnsi="Times New Roman" w:cs="Times New Roman"/>
+        </w:rPr>
+      </w:pPr>
+      <w:r>
+        <w:rPr>
+          <w:rFonts w:ascii="Times New Roman" w:hAnsi="Times New Roman" w:cs="Times New Roman"/>
+        </w:rPr>
+        <w:t>B: Constraints</w:t>
+      </w:r>
+    </w:p>
+    <w:p>
+      <w:pPr>
+        <w:rPr>
+          <w:rFonts w:ascii="Times New Roman" w:hAnsi="Times New Roman" w:cs="Times New Roman"/>
+        </w:rPr>
+      </w:pPr>
+      <w:r>
+        <w:rPr>
+          <w:rFonts w:ascii="Times New Roman" w:hAnsi="Times New Roman" w:cs="Times New Roman"/>
+        </w:rPr>
+        <w:tab/>
+        <w:t>Here I will talk about some of the constraints that they can run into when implementing an MLOps Solution and here they are.</w:t>
       </w:r>
     </w:p>
     <w:p>
@@ -168,7 +223,7 @@
         <w:pStyle w:val="ListParagraph"/>
         <w:numPr>
           <w:ilvl w:val="0"/>
-          <w:numId w:val="1"/>
+          <w:numId w:val="6"/>
         </w:numPr>
         <w:rPr>
           <w:rFonts w:ascii="Times New Roman" w:hAnsi="Times New Roman" w:cs="Times New Roman"/>
@@ -178,62 +233,31 @@
         <w:rPr>
           <w:rFonts w:ascii="Times New Roman" w:hAnsi="Times New Roman" w:cs="Times New Roman"/>
         </w:rPr>
-        <w:t xml:space="preserve">Secure Intellectual Property: As </w:t>
-      </w:r>
-      <w:proofErr w:type="spellStart"/>
-      <w:r>
-        <w:rPr>
-          <w:rFonts w:ascii="Times New Roman" w:hAnsi="Times New Roman" w:cs="Times New Roman"/>
-        </w:rPr>
-        <w:t>Kronkers</w:t>
-      </w:r>
-      <w:proofErr w:type="spellEnd"/>
-      <w:r>
-        <w:rPr>
-          <w:rFonts w:ascii="Times New Roman" w:hAnsi="Times New Roman" w:cs="Times New Roman"/>
-        </w:rPr>
-        <w:t xml:space="preserve"> expands into new regions and faces high competition, the architecture must secure data insights and trade secrets. The objective of this objective will be to protect the company’s advantage derived from its data.</w:t>
-      </w:r>
-    </w:p>
-    <w:p>
-      <w:pPr>
-        <w:rPr>
-          <w:rFonts w:ascii="Times New Roman" w:hAnsi="Times New Roman" w:cs="Times New Roman"/>
-        </w:rPr>
-      </w:pPr>
-      <w:r>
-        <w:rPr>
-          <w:rFonts w:ascii="Times New Roman" w:hAnsi="Times New Roman" w:cs="Times New Roman"/>
-        </w:rPr>
-        <w:t>B: Constraints</w:t>
-      </w:r>
-    </w:p>
-    <w:p>
-      <w:pPr>
-        <w:rPr>
-          <w:rFonts w:ascii="Times New Roman" w:hAnsi="Times New Roman" w:cs="Times New Roman"/>
-        </w:rPr>
-      </w:pPr>
-      <w:r>
-        <w:rPr>
-          <w:rFonts w:ascii="Times New Roman" w:hAnsi="Times New Roman" w:cs="Times New Roman"/>
-        </w:rPr>
-        <w:tab/>
-        <w:t xml:space="preserve">Here I will talk about some of the constraints that they can run into when implementing an </w:t>
-      </w:r>
-      <w:proofErr w:type="spellStart"/>
-      <w:r>
-        <w:rPr>
-          <w:rFonts w:ascii="Times New Roman" w:hAnsi="Times New Roman" w:cs="Times New Roman"/>
-        </w:rPr>
-        <w:t>MLOps</w:t>
-      </w:r>
-      <w:proofErr w:type="spellEnd"/>
-      <w:r>
-        <w:rPr>
-          <w:rFonts w:ascii="Times New Roman" w:hAnsi="Times New Roman" w:cs="Times New Roman"/>
-        </w:rPr>
-        <w:t xml:space="preserve"> Solution and here they are.</w:t>
+        <w:t>Budget</w:t>
+      </w:r>
+      <w:r>
+        <w:rPr>
+          <w:rFonts w:ascii="Times New Roman" w:hAnsi="Times New Roman" w:cs="Times New Roman"/>
+        </w:rPr>
+        <w:t>ary Constraint: Limited Funding for MLOps</w:t>
+      </w:r>
+    </w:p>
+    <w:p>
+      <w:pPr>
+        <w:pStyle w:val="ListParagraph"/>
+        <w:numPr>
+          <w:ilvl w:val="1"/>
+          <w:numId w:val="6"/>
+        </w:numPr>
+        <w:rPr>
+          <w:rFonts w:ascii="Times New Roman" w:hAnsi="Times New Roman" w:cs="Times New Roman"/>
+        </w:rPr>
+      </w:pPr>
+      <w:r>
+        <w:rPr>
+          <w:rFonts w:ascii="Times New Roman" w:hAnsi="Times New Roman" w:cs="Times New Roman"/>
+        </w:rPr>
+        <w:t xml:space="preserve">Justification: We need the proposed solution to be highly cost-effective to fit the financial constraint. As, we know that there is a small budget allocated for machine learning model maintenance, tracking, and quality control. </w:t>
       </w:r>
     </w:p>
     <w:p>
@@ -241,7 +265,7 @@
         <w:pStyle w:val="ListParagraph"/>
         <w:numPr>
           <w:ilvl w:val="0"/>
-          <w:numId w:val="2"/>
+          <w:numId w:val="6"/>
         </w:numPr>
         <w:rPr>
           <w:rFonts w:ascii="Times New Roman" w:hAnsi="Times New Roman" w:cs="Times New Roman"/>
@@ -251,7 +275,25 @@
         <w:rPr>
           <w:rFonts w:ascii="Times New Roman" w:hAnsi="Times New Roman" w:cs="Times New Roman"/>
         </w:rPr>
-        <w:t>Budgetary Restrictions: The project is constrained by a small budget that is allocated for the current year. This will require us to come up with a cost-effective solution that can maximize value without requiring massive capital expenditure.</w:t>
+        <w:t>Organizational Constraint: Leadership Skepticism</w:t>
+      </w:r>
+    </w:p>
+    <w:p>
+      <w:pPr>
+        <w:pStyle w:val="ListParagraph"/>
+        <w:numPr>
+          <w:ilvl w:val="1"/>
+          <w:numId w:val="6"/>
+        </w:numPr>
+        <w:rPr>
+          <w:rFonts w:ascii="Times New Roman" w:hAnsi="Times New Roman" w:cs="Times New Roman"/>
+        </w:rPr>
+      </w:pPr>
+      <w:r>
+        <w:rPr>
+          <w:rFonts w:ascii="Times New Roman" w:hAnsi="Times New Roman" w:cs="Times New Roman"/>
+        </w:rPr>
+        <w:t xml:space="preserve">Justification: </w:t>
       </w:r>
     </w:p>
     <w:p>
@@ -259,7 +301,7 @@
         <w:pStyle w:val="ListParagraph"/>
         <w:numPr>
           <w:ilvl w:val="0"/>
-          <w:numId w:val="2"/>
+          <w:numId w:val="6"/>
         </w:numPr>
         <w:rPr>
           <w:rFonts w:ascii="Times New Roman" w:hAnsi="Times New Roman" w:cs="Times New Roman"/>
@@ -269,21 +311,7 @@
         <w:rPr>
           <w:rFonts w:ascii="Times New Roman" w:hAnsi="Times New Roman" w:cs="Times New Roman"/>
         </w:rPr>
-        <w:t xml:space="preserve">Organizational Resistance: There is a cultural barrier, as several senior leaders question the utility of </w:t>
-      </w:r>
-      <w:proofErr w:type="spellStart"/>
-      <w:r>
-        <w:rPr>
-          <w:rFonts w:ascii="Times New Roman" w:hAnsi="Times New Roman" w:cs="Times New Roman"/>
-        </w:rPr>
-        <w:t>MLOps</w:t>
-      </w:r>
-      <w:proofErr w:type="spellEnd"/>
-      <w:r>
-        <w:rPr>
-          <w:rFonts w:ascii="Times New Roman" w:hAnsi="Times New Roman" w:cs="Times New Roman"/>
-        </w:rPr>
-        <w:t>, therefore the solution must demonstrate clear values to get the right people to allow the project.</w:t>
+        <w:t>Technical/Personnel Constraint: Lack of Dedicated Deployment Roles</w:t>
       </w:r>
     </w:p>
     <w:p>
@@ -291,7 +319,7 @@
         <w:pStyle w:val="ListParagraph"/>
         <w:numPr>
           <w:ilvl w:val="0"/>
-          <w:numId w:val="2"/>
+          <w:numId w:val="6"/>
         </w:numPr>
         <w:rPr>
           <w:rFonts w:ascii="Times New Roman" w:hAnsi="Times New Roman" w:cs="Times New Roman"/>
@@ -301,40 +329,7 @@
         <w:rPr>
           <w:rFonts w:ascii="Times New Roman" w:hAnsi="Times New Roman" w:cs="Times New Roman"/>
         </w:rPr>
-        <w:t xml:space="preserve">Lack of Specialized Personnel: </w:t>
-      </w:r>
-      <w:proofErr w:type="spellStart"/>
-      <w:r>
-        <w:rPr>
-          <w:rFonts w:ascii="Times New Roman" w:hAnsi="Times New Roman" w:cs="Times New Roman"/>
-        </w:rPr>
-        <w:t>Kronkers</w:t>
-      </w:r>
-      <w:proofErr w:type="spellEnd"/>
-      <w:r>
-        <w:rPr>
-          <w:rFonts w:ascii="Times New Roman" w:hAnsi="Times New Roman" w:cs="Times New Roman"/>
-        </w:rPr>
-        <w:t xml:space="preserve"> currently has no dedicated role for the maintenance code, machine learning models, or deployment. Therefore, the project must be managed by the analysts that are already apart of the team without requiring a lot of new hiring of a large team of new DevOps engineers.</w:t>
-      </w:r>
-    </w:p>
-    <w:p>
-      <w:pPr>
-        <w:pStyle w:val="ListParagraph"/>
-        <w:numPr>
-          <w:ilvl w:val="0"/>
-          <w:numId w:val="2"/>
-        </w:numPr>
-        <w:rPr>
-          <w:rFonts w:ascii="Times New Roman" w:hAnsi="Times New Roman" w:cs="Times New Roman"/>
-        </w:rPr>
-      </w:pPr>
-      <w:r>
-        <w:rPr>
-          <w:rFonts w:ascii="Times New Roman" w:hAnsi="Times New Roman" w:cs="Times New Roman"/>
-        </w:rPr>
-        <w:lastRenderedPageBreak/>
-        <w:t>Legacy Infrastructure: The current way of doing things relies on manual text file imports and disjointed execution environments, which creates technical debt that the new solution must overcome without disrupting operations.</w:t>
+        <w:t>Technical Constraint: Diverse Programming Languages</w:t>
       </w:r>
     </w:p>
     <w:p>
@@ -378,6 +373,7 @@
         <w:rPr>
           <w:rFonts w:ascii="Times New Roman" w:hAnsi="Times New Roman" w:cs="Times New Roman"/>
         </w:rPr>
+        <w:lastRenderedPageBreak/>
         <w:t xml:space="preserve">Multi-Language Execution Environment: </w:t>
       </w:r>
       <w:r>
@@ -690,6 +686,178 @@
     </w:lvl>
   </w:abstractNum>
   <w:abstractNum w:abstractNumId="1" w15:restartNumberingAfterBreak="0">
+    <w:nsid w:val="10D1530F"/>
+    <w:multiLevelType w:val="hybridMultilevel"/>
+    <w:tmpl w:val="75A825E2"/>
+    <w:lvl w:ilvl="0" w:tplc="0409000F">
+      <w:start w:val="1"/>
+      <w:numFmt w:val="decimal"/>
+      <w:lvlText w:val="%1."/>
+      <w:lvlJc w:val="left"/>
+      <w:pPr>
+        <w:ind w:left="720" w:hanging="360"/>
+      </w:pPr>
+    </w:lvl>
+    <w:lvl w:ilvl="1" w:tplc="04090019">
+      <w:start w:val="1"/>
+      <w:numFmt w:val="lowerLetter"/>
+      <w:lvlText w:val="%2."/>
+      <w:lvlJc w:val="left"/>
+      <w:pPr>
+        <w:ind w:left="1440" w:hanging="360"/>
+      </w:pPr>
+    </w:lvl>
+    <w:lvl w:ilvl="2" w:tplc="0409001B" w:tentative="1">
+      <w:start w:val="1"/>
+      <w:numFmt w:val="lowerRoman"/>
+      <w:lvlText w:val="%3."/>
+      <w:lvlJc w:val="right"/>
+      <w:pPr>
+        <w:ind w:left="2160" w:hanging="180"/>
+      </w:pPr>
+    </w:lvl>
+    <w:lvl w:ilvl="3" w:tplc="0409000F" w:tentative="1">
+      <w:start w:val="1"/>
+      <w:numFmt w:val="decimal"/>
+      <w:lvlText w:val="%4."/>
+      <w:lvlJc w:val="left"/>
+      <w:pPr>
+        <w:ind w:left="2880" w:hanging="360"/>
+      </w:pPr>
+    </w:lvl>
+    <w:lvl w:ilvl="4" w:tplc="04090019" w:tentative="1">
+      <w:start w:val="1"/>
+      <w:numFmt w:val="lowerLetter"/>
+      <w:lvlText w:val="%5."/>
+      <w:lvlJc w:val="left"/>
+      <w:pPr>
+        <w:ind w:left="3600" w:hanging="360"/>
+      </w:pPr>
+    </w:lvl>
+    <w:lvl w:ilvl="5" w:tplc="0409001B" w:tentative="1">
+      <w:start w:val="1"/>
+      <w:numFmt w:val="lowerRoman"/>
+      <w:lvlText w:val="%6."/>
+      <w:lvlJc w:val="right"/>
+      <w:pPr>
+        <w:ind w:left="4320" w:hanging="180"/>
+      </w:pPr>
+    </w:lvl>
+    <w:lvl w:ilvl="6" w:tplc="0409000F" w:tentative="1">
+      <w:start w:val="1"/>
+      <w:numFmt w:val="decimal"/>
+      <w:lvlText w:val="%7."/>
+      <w:lvlJc w:val="left"/>
+      <w:pPr>
+        <w:ind w:left="5040" w:hanging="360"/>
+      </w:pPr>
+    </w:lvl>
+    <w:lvl w:ilvl="7" w:tplc="04090019" w:tentative="1">
+      <w:start w:val="1"/>
+      <w:numFmt w:val="lowerLetter"/>
+      <w:lvlText w:val="%8."/>
+      <w:lvlJc w:val="left"/>
+      <w:pPr>
+        <w:ind w:left="5760" w:hanging="360"/>
+      </w:pPr>
+    </w:lvl>
+    <w:lvl w:ilvl="8" w:tplc="0409001B" w:tentative="1">
+      <w:start w:val="1"/>
+      <w:numFmt w:val="lowerRoman"/>
+      <w:lvlText w:val="%9."/>
+      <w:lvlJc w:val="right"/>
+      <w:pPr>
+        <w:ind w:left="6480" w:hanging="180"/>
+      </w:pPr>
+    </w:lvl>
+  </w:abstractNum>
+  <w:abstractNum w:abstractNumId="2" w15:restartNumberingAfterBreak="0">
+    <w:nsid w:val="3A131E43"/>
+    <w:multiLevelType w:val="hybridMultilevel"/>
+    <w:tmpl w:val="69BE3DD0"/>
+    <w:lvl w:ilvl="0" w:tplc="0409000F">
+      <w:start w:val="1"/>
+      <w:numFmt w:val="decimal"/>
+      <w:lvlText w:val="%1."/>
+      <w:lvlJc w:val="left"/>
+      <w:pPr>
+        <w:ind w:left="720" w:hanging="360"/>
+      </w:pPr>
+    </w:lvl>
+    <w:lvl w:ilvl="1" w:tplc="04090019">
+      <w:start w:val="1"/>
+      <w:numFmt w:val="lowerLetter"/>
+      <w:lvlText w:val="%2."/>
+      <w:lvlJc w:val="left"/>
+      <w:pPr>
+        <w:ind w:left="1440" w:hanging="360"/>
+      </w:pPr>
+    </w:lvl>
+    <w:lvl w:ilvl="2" w:tplc="0409001B" w:tentative="1">
+      <w:start w:val="1"/>
+      <w:numFmt w:val="lowerRoman"/>
+      <w:lvlText w:val="%3."/>
+      <w:lvlJc w:val="right"/>
+      <w:pPr>
+        <w:ind w:left="2160" w:hanging="180"/>
+      </w:pPr>
+    </w:lvl>
+    <w:lvl w:ilvl="3" w:tplc="0409000F" w:tentative="1">
+      <w:start w:val="1"/>
+      <w:numFmt w:val="decimal"/>
+      <w:lvlText w:val="%4."/>
+      <w:lvlJc w:val="left"/>
+      <w:pPr>
+        <w:ind w:left="2880" w:hanging="360"/>
+      </w:pPr>
+    </w:lvl>
+    <w:lvl w:ilvl="4" w:tplc="04090019" w:tentative="1">
+      <w:start w:val="1"/>
+      <w:numFmt w:val="lowerLetter"/>
+      <w:lvlText w:val="%5."/>
+      <w:lvlJc w:val="left"/>
+      <w:pPr>
+        <w:ind w:left="3600" w:hanging="360"/>
+      </w:pPr>
+    </w:lvl>
+    <w:lvl w:ilvl="5" w:tplc="0409001B" w:tentative="1">
+      <w:start w:val="1"/>
+      <w:numFmt w:val="lowerRoman"/>
+      <w:lvlText w:val="%6."/>
+      <w:lvlJc w:val="right"/>
+      <w:pPr>
+        <w:ind w:left="4320" w:hanging="180"/>
+      </w:pPr>
+    </w:lvl>
+    <w:lvl w:ilvl="6" w:tplc="0409000F" w:tentative="1">
+      <w:start w:val="1"/>
+      <w:numFmt w:val="decimal"/>
+      <w:lvlText w:val="%7."/>
+      <w:lvlJc w:val="left"/>
+      <w:pPr>
+        <w:ind w:left="5040" w:hanging="360"/>
+      </w:pPr>
+    </w:lvl>
+    <w:lvl w:ilvl="7" w:tplc="04090019" w:tentative="1">
+      <w:start w:val="1"/>
+      <w:numFmt w:val="lowerLetter"/>
+      <w:lvlText w:val="%8."/>
+      <w:lvlJc w:val="left"/>
+      <w:pPr>
+        <w:ind w:left="5760" w:hanging="360"/>
+      </w:pPr>
+    </w:lvl>
+    <w:lvl w:ilvl="8" w:tplc="0409001B" w:tentative="1">
+      <w:start w:val="1"/>
+      <w:numFmt w:val="lowerRoman"/>
+      <w:lvlText w:val="%9."/>
+      <w:lvlJc w:val="right"/>
+      <w:pPr>
+        <w:ind w:left="6480" w:hanging="180"/>
+      </w:pPr>
+    </w:lvl>
+  </w:abstractNum>
+  <w:abstractNum w:abstractNumId="3" w15:restartNumberingAfterBreak="0">
     <w:nsid w:val="5528398C"/>
     <w:multiLevelType w:val="hybridMultilevel"/>
     <w:tmpl w:val="BE1EF584"/>
@@ -802,7 +970,7 @@
       </w:rPr>
     </w:lvl>
   </w:abstractNum>
-  <w:abstractNum w:abstractNumId="2" w15:restartNumberingAfterBreak="0">
+  <w:abstractNum w:abstractNumId="4" w15:restartNumberingAfterBreak="0">
     <w:nsid w:val="60BE316F"/>
     <w:multiLevelType w:val="hybridMultilevel"/>
     <w:tmpl w:val="6E5A152E"/>
@@ -888,7 +1056,7 @@
       </w:pPr>
     </w:lvl>
   </w:abstractNum>
-  <w:abstractNum w:abstractNumId="3" w15:restartNumberingAfterBreak="0">
+  <w:abstractNum w:abstractNumId="5" w15:restartNumberingAfterBreak="0">
     <w:nsid w:val="7D642C3C"/>
     <w:multiLevelType w:val="hybridMultilevel"/>
     <w:tmpl w:val="687E15A8"/>
@@ -1002,15 +1170,21 @@
     </w:lvl>
   </w:abstractNum>
   <w:num w:numId="1" w16cid:durableId="1777284622">
-    <w:abstractNumId w:val="3"/>
+    <w:abstractNumId w:val="5"/>
   </w:num>
   <w:num w:numId="2" w16cid:durableId="1784884502">
-    <w:abstractNumId w:val="1"/>
+    <w:abstractNumId w:val="3"/>
   </w:num>
   <w:num w:numId="3" w16cid:durableId="1558080829">
     <w:abstractNumId w:val="0"/>
   </w:num>
   <w:num w:numId="4" w16cid:durableId="1674911464">
+    <w:abstractNumId w:val="4"/>
+  </w:num>
+  <w:num w:numId="5" w16cid:durableId="1489320003">
+    <w:abstractNumId w:val="1"/>
+  </w:num>
+  <w:num w:numId="6" w16cid:durableId="536822279">
     <w:abstractNumId w:val="2"/>
   </w:num>
 </w:numbering>

</xml_diff>

<commit_message>
Fixed the word document
</commit_message>
<xml_diff>
--- a/D602/Task 1/D602_task1.docx
+++ b/D602/Task 1/D602_task1.docx
@@ -295,6 +295,12 @@
         </w:rPr>
         <w:t xml:space="preserve">Justification: </w:t>
       </w:r>
+      <w:r>
+        <w:rPr>
+          <w:rFonts w:ascii="Times New Roman" w:hAnsi="Times New Roman" w:cs="Times New Roman"/>
+        </w:rPr>
+        <w:t>From the file included it shows that there are several people that question the utility of MLOps, so the implementation will need to demonstrate immediate value to overcome this internal doubt.</w:t>
+      </w:r>
     </w:p>
     <w:p>
       <w:pPr>
@@ -318,6 +324,30 @@
       <w:pPr>
         <w:pStyle w:val="ListParagraph"/>
         <w:numPr>
+          <w:ilvl w:val="1"/>
+          <w:numId w:val="6"/>
+        </w:numPr>
+        <w:rPr>
+          <w:rFonts w:ascii="Times New Roman" w:hAnsi="Times New Roman" w:cs="Times New Roman"/>
+        </w:rPr>
+      </w:pPr>
+      <w:r>
+        <w:rPr>
+          <w:rFonts w:ascii="Times New Roman" w:hAnsi="Times New Roman" w:cs="Times New Roman"/>
+        </w:rPr>
+        <w:t xml:space="preserve">Justification: </w:t>
+      </w:r>
+      <w:r>
+        <w:rPr>
+          <w:rFonts w:ascii="Times New Roman" w:hAnsi="Times New Roman" w:cs="Times New Roman"/>
+        </w:rPr>
+        <w:t>Although the company does have staff already, there is no dedicated role to maintain code, machine learning models, or deployment. That is why the MLOps solution must be manageable by the existing analyst without requiring the immediate hire of specialized DevOps engineers.</w:t>
+      </w:r>
+    </w:p>
+    <w:p>
+      <w:pPr>
+        <w:pStyle w:val="ListParagraph"/>
+        <w:numPr>
           <w:ilvl w:val="0"/>
           <w:numId w:val="6"/>
         </w:numPr>
@@ -329,7 +359,38 @@
         <w:rPr>
           <w:rFonts w:ascii="Times New Roman" w:hAnsi="Times New Roman" w:cs="Times New Roman"/>
         </w:rPr>
+        <w:lastRenderedPageBreak/>
         <w:t>Technical Constraint: Diverse Programming Languages</w:t>
+      </w:r>
+    </w:p>
+    <w:p>
+      <w:pPr>
+        <w:pStyle w:val="ListParagraph"/>
+        <w:numPr>
+          <w:ilvl w:val="1"/>
+          <w:numId w:val="6"/>
+        </w:numPr>
+        <w:rPr>
+          <w:rFonts w:ascii="Times New Roman" w:hAnsi="Times New Roman" w:cs="Times New Roman"/>
+        </w:rPr>
+      </w:pPr>
+      <w:r>
+        <w:rPr>
+          <w:rFonts w:ascii="Times New Roman" w:hAnsi="Times New Roman" w:cs="Times New Roman"/>
+        </w:rPr>
+        <w:t xml:space="preserve">Justification: </w:t>
+      </w:r>
+      <w:r>
+        <w:rPr>
+          <w:rFonts w:ascii="Times New Roman" w:hAnsi="Times New Roman" w:cs="Times New Roman"/>
+        </w:rPr>
+        <w:t>As of right now the analyst at company are writing code in Python, R, and Julia, there is no standard for writing code. The MLOps architecture</w:t>
+      </w:r>
+      <w:r>
+        <w:rPr>
+          <w:rFonts w:ascii="Times New Roman" w:hAnsi="Times New Roman" w:cs="Times New Roman"/>
+        </w:rPr>
+        <w:t xml:space="preserve"> will help as it cannot be locked into a single language and must accommodate all three.</w:t>
       </w:r>
     </w:p>
     <w:p>
@@ -363,7 +424,7 @@
         <w:pStyle w:val="ListParagraph"/>
         <w:numPr>
           <w:ilvl w:val="0"/>
-          <w:numId w:val="3"/>
+          <w:numId w:val="7"/>
         </w:numPr>
         <w:rPr>
           <w:rFonts w:ascii="Times New Roman" w:hAnsi="Times New Roman" w:cs="Times New Roman"/>
@@ -373,14 +434,31 @@
         <w:rPr>
           <w:rFonts w:ascii="Times New Roman" w:hAnsi="Times New Roman" w:cs="Times New Roman"/>
         </w:rPr>
-        <w:lastRenderedPageBreak/>
-        <w:t xml:space="preserve">Multi-Language Execution Environment: </w:t>
-      </w:r>
-      <w:r>
-        <w:rPr>
-          <w:rFonts w:ascii="Times New Roman" w:hAnsi="Times New Roman" w:cs="Times New Roman"/>
-        </w:rPr>
-        <w:t>The new system must be able to manage and execute models developed in Python, R and Julia.</w:t>
+        <w:t>Multi-Language Deployment Accommodation</w:t>
+      </w:r>
+    </w:p>
+    <w:p>
+      <w:pPr>
+        <w:pStyle w:val="ListParagraph"/>
+        <w:numPr>
+          <w:ilvl w:val="1"/>
+          <w:numId w:val="7"/>
+        </w:numPr>
+        <w:rPr>
+          <w:rFonts w:ascii="Times New Roman" w:hAnsi="Times New Roman" w:cs="Times New Roman"/>
+        </w:rPr>
+      </w:pPr>
+      <w:r>
+        <w:rPr>
+          <w:rFonts w:ascii="Times New Roman" w:hAnsi="Times New Roman" w:cs="Times New Roman"/>
+        </w:rPr>
+        <w:t xml:space="preserve">Justification: </w:t>
+      </w:r>
+      <w:r>
+        <w:rPr>
+          <w:rFonts w:ascii="Times New Roman" w:hAnsi="Times New Roman" w:cs="Times New Roman"/>
+        </w:rPr>
+        <w:t>From the file provided it specifies that the machine learning models are written in several different languages and therefore the system must functionally execute code from different environments. The main languages that it needs to support are Python, R, and Julia.</w:t>
       </w:r>
     </w:p>
     <w:p>
@@ -388,7 +466,7 @@
         <w:pStyle w:val="ListParagraph"/>
         <w:numPr>
           <w:ilvl w:val="0"/>
-          <w:numId w:val="3"/>
+          <w:numId w:val="7"/>
         </w:numPr>
         <w:rPr>
           <w:rFonts w:ascii="Times New Roman" w:hAnsi="Times New Roman" w:cs="Times New Roman"/>
@@ -398,7 +476,43 @@
         <w:rPr>
           <w:rFonts w:ascii="Times New Roman" w:hAnsi="Times New Roman" w:cs="Times New Roman"/>
         </w:rPr>
-        <w:t>Centralized Model Registry: For the final solution there must be one method to store code, model artifacts, and datasets, replacing the current OneDrive approach.</w:t>
+        <w:t>Cross Department Access for Training and Prediction</w:t>
+      </w:r>
+    </w:p>
+    <w:p>
+      <w:pPr>
+        <w:pStyle w:val="ListParagraph"/>
+        <w:numPr>
+          <w:ilvl w:val="1"/>
+          <w:numId w:val="7"/>
+        </w:numPr>
+        <w:rPr>
+          <w:rFonts w:ascii="Times New Roman" w:hAnsi="Times New Roman" w:cs="Times New Roman"/>
+        </w:rPr>
+      </w:pPr>
+      <w:r>
+        <w:rPr>
+          <w:rFonts w:ascii="Times New Roman" w:hAnsi="Times New Roman" w:cs="Times New Roman"/>
+        </w:rPr>
+        <w:t xml:space="preserve">Justification: </w:t>
+      </w:r>
+      <w:r>
+        <w:rPr>
+          <w:rFonts w:ascii="Times New Roman" w:hAnsi="Times New Roman" w:cs="Times New Roman"/>
+        </w:rPr>
+        <w:t>Since</w:t>
+      </w:r>
+      <w:r>
+        <w:rPr>
+          <w:rFonts w:ascii="Times New Roman" w:hAnsi="Times New Roman" w:cs="Times New Roman"/>
+        </w:rPr>
+        <w:t xml:space="preserve"> the models will be accessed by different teams, this system will allow the other teams to access them easily. This will answer </w:t>
+      </w:r>
+      <w:r>
+        <w:rPr>
+          <w:rFonts w:ascii="Times New Roman" w:hAnsi="Times New Roman" w:cs="Times New Roman"/>
+        </w:rPr>
+        <w:t>the request for methods that allow various departments to train the models and run the predictions.</w:t>
       </w:r>
     </w:p>
     <w:p>
@@ -406,7 +520,7 @@
         <w:pStyle w:val="ListParagraph"/>
         <w:numPr>
           <w:ilvl w:val="0"/>
-          <w:numId w:val="3"/>
+          <w:numId w:val="7"/>
         </w:numPr>
         <w:rPr>
           <w:rFonts w:ascii="Times New Roman" w:hAnsi="Times New Roman" w:cs="Times New Roman"/>
@@ -416,13 +530,38 @@
         <w:rPr>
           <w:rFonts w:ascii="Times New Roman" w:hAnsi="Times New Roman" w:cs="Times New Roman"/>
         </w:rPr>
-        <w:t>Cross Department</w:t>
-      </w:r>
-      <w:r>
-        <w:rPr>
-          <w:rFonts w:ascii="Times New Roman" w:hAnsi="Times New Roman" w:cs="Times New Roman"/>
-        </w:rPr>
-        <w:t xml:space="preserve"> Access Control: The system must allow many different users from different departments to access the models for training and prediction purposes.</w:t>
+        <w:t>Centralized Storage for Code Artifacts and Data</w:t>
+      </w:r>
+    </w:p>
+    <w:p>
+      <w:pPr>
+        <w:pStyle w:val="ListParagraph"/>
+        <w:numPr>
+          <w:ilvl w:val="1"/>
+          <w:numId w:val="7"/>
+        </w:numPr>
+        <w:rPr>
+          <w:rFonts w:ascii="Times New Roman" w:hAnsi="Times New Roman" w:cs="Times New Roman"/>
+        </w:rPr>
+      </w:pPr>
+      <w:r>
+        <w:rPr>
+          <w:rFonts w:ascii="Times New Roman" w:hAnsi="Times New Roman" w:cs="Times New Roman"/>
+        </w:rPr>
+        <w:t>Justification: Here the system will replace the shared OneDrive that the company is currently using as it’s not efficient. Also, since it’s asking for a method to store code and machine learning model artifacts and datasets upon which these models are based.</w:t>
+      </w:r>
+    </w:p>
+    <w:p>
+      <w:pPr>
+        <w:rPr>
+          <w:rFonts w:ascii="Times New Roman" w:hAnsi="Times New Roman" w:cs="Times New Roman"/>
+        </w:rPr>
+      </w:pPr>
+      <w:r>
+        <w:rPr>
+          <w:rFonts w:ascii="Times New Roman" w:hAnsi="Times New Roman" w:cs="Times New Roman"/>
+        </w:rPr>
+        <w:t>Here are the Nonfunctional Requirements</w:t>
       </w:r>
     </w:p>
     <w:p>
@@ -430,7 +569,7 @@
         <w:pStyle w:val="ListParagraph"/>
         <w:numPr>
           <w:ilvl w:val="0"/>
-          <w:numId w:val="3"/>
+          <w:numId w:val="8"/>
         </w:numPr>
         <w:rPr>
           <w:rFonts w:ascii="Times New Roman" w:hAnsi="Times New Roman" w:cs="Times New Roman"/>
@@ -440,7 +579,31 @@
         <w:rPr>
           <w:rFonts w:ascii="Times New Roman" w:hAnsi="Times New Roman" w:cs="Times New Roman"/>
         </w:rPr>
-        <w:t>Automated Pipeline Triggers: The system must support automated input handling to replace the manual entry shifts in customer demand or other parameters.</w:t>
+        <w:t>High Security and IP Protection</w:t>
+      </w:r>
+    </w:p>
+    <w:p>
+      <w:pPr>
+        <w:pStyle w:val="ListParagraph"/>
+        <w:numPr>
+          <w:ilvl w:val="1"/>
+          <w:numId w:val="8"/>
+        </w:numPr>
+        <w:rPr>
+          <w:rFonts w:ascii="Times New Roman" w:hAnsi="Times New Roman" w:cs="Times New Roman"/>
+        </w:rPr>
+      </w:pPr>
+      <w:r>
+        <w:rPr>
+          <w:rFonts w:ascii="Times New Roman" w:hAnsi="Times New Roman" w:cs="Times New Roman"/>
+        </w:rPr>
+        <w:t xml:space="preserve">Justification: </w:t>
+      </w:r>
+      <w:r>
+        <w:rPr>
+          <w:rFonts w:ascii="Times New Roman" w:hAnsi="Times New Roman" w:cs="Times New Roman"/>
+        </w:rPr>
+        <w:t>The system needs to be highly secure to protect the company’s competitive advantage. The company has an increasing need to protect insights like intellectual property and trade secrets from competitors as they try to expand into newer regions.</w:t>
       </w:r>
     </w:p>
     <w:p>
@@ -448,7 +611,7 @@
         <w:pStyle w:val="ListParagraph"/>
         <w:numPr>
           <w:ilvl w:val="0"/>
-          <w:numId w:val="3"/>
+          <w:numId w:val="8"/>
         </w:numPr>
         <w:rPr>
           <w:rFonts w:ascii="Times New Roman" w:hAnsi="Times New Roman" w:cs="Times New Roman"/>
@@ -458,20 +621,25 @@
         <w:rPr>
           <w:rFonts w:ascii="Times New Roman" w:hAnsi="Times New Roman" w:cs="Times New Roman"/>
         </w:rPr>
-        <w:t>Version Control: There must be version control for the data and the code with changes being documented, whether it’s changes to the data or the models.</w:t>
-      </w:r>
-    </w:p>
-    <w:p>
-      <w:pPr>
-        <w:rPr>
-          <w:rFonts w:ascii="Times New Roman" w:hAnsi="Times New Roman" w:cs="Times New Roman"/>
-        </w:rPr>
-      </w:pPr>
-      <w:r>
-        <w:rPr>
-          <w:rFonts w:ascii="Times New Roman" w:hAnsi="Times New Roman" w:cs="Times New Roman"/>
-        </w:rPr>
-        <w:t>Here are the Non-Functional Requirements</w:t>
+        <w:t>Cost Effectiveness</w:t>
+      </w:r>
+    </w:p>
+    <w:p>
+      <w:pPr>
+        <w:pStyle w:val="ListParagraph"/>
+        <w:numPr>
+          <w:ilvl w:val="1"/>
+          <w:numId w:val="8"/>
+        </w:numPr>
+        <w:rPr>
+          <w:rFonts w:ascii="Times New Roman" w:hAnsi="Times New Roman" w:cs="Times New Roman"/>
+        </w:rPr>
+      </w:pPr>
+      <w:r>
+        <w:rPr>
+          <w:rFonts w:ascii="Times New Roman" w:hAnsi="Times New Roman" w:cs="Times New Roman"/>
+        </w:rPr>
+        <w:t xml:space="preserve">Justification: We need the systems to run efficiently, will keep the cost low. This is because the company has allocated just a small budget for these MLOps activities in the current fiscal year. </w:t>
       </w:r>
     </w:p>
     <w:p>
@@ -479,7 +647,7 @@
         <w:pStyle w:val="ListParagraph"/>
         <w:numPr>
           <w:ilvl w:val="0"/>
-          <w:numId w:val="4"/>
+          <w:numId w:val="8"/>
         </w:numPr>
         <w:rPr>
           <w:rFonts w:ascii="Times New Roman" w:hAnsi="Times New Roman" w:cs="Times New Roman"/>
@@ -489,15 +657,15 @@
         <w:rPr>
           <w:rFonts w:ascii="Times New Roman" w:hAnsi="Times New Roman" w:cs="Times New Roman"/>
         </w:rPr>
-        <w:t>Security and Protection: The architecture must include security measures to protect insights and company information, ensuring that the important data does not get leaked out to the public.</w:t>
+        <w:t>High Usability and Low Maintenance</w:t>
       </w:r>
     </w:p>
     <w:p>
       <w:pPr>
         <w:pStyle w:val="ListParagraph"/>
         <w:numPr>
-          <w:ilvl w:val="0"/>
-          <w:numId w:val="4"/>
+          <w:ilvl w:val="1"/>
+          <w:numId w:val="8"/>
         </w:numPr>
         <w:rPr>
           <w:rFonts w:ascii="Times New Roman" w:hAnsi="Times New Roman" w:cs="Times New Roman"/>
@@ -507,55 +675,29 @@
         <w:rPr>
           <w:rFonts w:ascii="Times New Roman" w:hAnsi="Times New Roman" w:cs="Times New Roman"/>
         </w:rPr>
-        <w:t xml:space="preserve">Scalability: It must be able to support the company’s continuing growth into new geographic regions and the associated increase in data volume. </w:t>
+        <w:t xml:space="preserve">Justification: As we know the company has no role dedicated to maintenance or deployment, the system then must be stable and easy to use for the existing data analyst. It cannot require extensive administrative overhead to function daily. </w:t>
       </w:r>
     </w:p>
     <w:p>
       <w:pPr>
         <w:pStyle w:val="ListParagraph"/>
-        <w:numPr>
-          <w:ilvl w:val="0"/>
-          <w:numId w:val="4"/>
-        </w:numPr>
-        <w:rPr>
-          <w:rFonts w:ascii="Times New Roman" w:hAnsi="Times New Roman" w:cs="Times New Roman"/>
-        </w:rPr>
-      </w:pPr>
-      <w:r>
-        <w:rPr>
-          <w:rFonts w:ascii="Times New Roman" w:hAnsi="Times New Roman" w:cs="Times New Roman"/>
-        </w:rPr>
-        <w:t>Usability: The new system must be accessible to analysts with varying skill sets who are currently accustomed to working on individual laptops.</w:t>
-      </w:r>
-    </w:p>
-    <w:p>
-      <w:pPr>
-        <w:pStyle w:val="ListParagraph"/>
-        <w:numPr>
-          <w:ilvl w:val="0"/>
-          <w:numId w:val="4"/>
-        </w:numPr>
-        <w:rPr>
-          <w:rFonts w:ascii="Times New Roman" w:hAnsi="Times New Roman" w:cs="Times New Roman"/>
-        </w:rPr>
-      </w:pPr>
-      <w:r>
-        <w:rPr>
-          <w:rFonts w:ascii="Times New Roman" w:hAnsi="Times New Roman" w:cs="Times New Roman"/>
-        </w:rPr>
-        <w:t>Maintainability: With the company’s lack of maintenance roles, the solution must have low maintenance overhead and high stability, this will help save cost as the company will not need to hire a new team.</w:t>
-      </w:r>
-    </w:p>
-    <w:p>
-      <w:pPr>
-        <w:rPr>
-          <w:rFonts w:ascii="Times New Roman" w:hAnsi="Times New Roman" w:cs="Times New Roman"/>
-        </w:rPr>
-      </w:pPr>
-      <w:r>
-        <w:rPr>
-          <w:rFonts w:ascii="Times New Roman" w:hAnsi="Times New Roman" w:cs="Times New Roman"/>
-        </w:rPr>
+        <w:ind w:left="1440"/>
+        <w:rPr>
+          <w:rFonts w:ascii="Times New Roman" w:hAnsi="Times New Roman" w:cs="Times New Roman"/>
+        </w:rPr>
+      </w:pPr>
+    </w:p>
+    <w:p>
+      <w:pPr>
+        <w:rPr>
+          <w:rFonts w:ascii="Times New Roman" w:hAnsi="Times New Roman" w:cs="Times New Roman"/>
+        </w:rPr>
+      </w:pPr>
+      <w:r>
+        <w:rPr>
+          <w:rFonts w:ascii="Times New Roman" w:hAnsi="Times New Roman" w:cs="Times New Roman"/>
+        </w:rPr>
+        <w:lastRenderedPageBreak/>
         <w:t>D: Sources</w:t>
       </w:r>
     </w:p>
@@ -1057,6 +1199,178 @@
     </w:lvl>
   </w:abstractNum>
   <w:abstractNum w:abstractNumId="5" w15:restartNumberingAfterBreak="0">
+    <w:nsid w:val="6FD76C9A"/>
+    <w:multiLevelType w:val="hybridMultilevel"/>
+    <w:tmpl w:val="60BA26FA"/>
+    <w:lvl w:ilvl="0" w:tplc="0409000F">
+      <w:start w:val="1"/>
+      <w:numFmt w:val="decimal"/>
+      <w:lvlText w:val="%1."/>
+      <w:lvlJc w:val="left"/>
+      <w:pPr>
+        <w:ind w:left="720" w:hanging="360"/>
+      </w:pPr>
+    </w:lvl>
+    <w:lvl w:ilvl="1" w:tplc="04090019">
+      <w:start w:val="1"/>
+      <w:numFmt w:val="lowerLetter"/>
+      <w:lvlText w:val="%2."/>
+      <w:lvlJc w:val="left"/>
+      <w:pPr>
+        <w:ind w:left="1440" w:hanging="360"/>
+      </w:pPr>
+    </w:lvl>
+    <w:lvl w:ilvl="2" w:tplc="0409001B" w:tentative="1">
+      <w:start w:val="1"/>
+      <w:numFmt w:val="lowerRoman"/>
+      <w:lvlText w:val="%3."/>
+      <w:lvlJc w:val="right"/>
+      <w:pPr>
+        <w:ind w:left="2160" w:hanging="180"/>
+      </w:pPr>
+    </w:lvl>
+    <w:lvl w:ilvl="3" w:tplc="0409000F" w:tentative="1">
+      <w:start w:val="1"/>
+      <w:numFmt w:val="decimal"/>
+      <w:lvlText w:val="%4."/>
+      <w:lvlJc w:val="left"/>
+      <w:pPr>
+        <w:ind w:left="2880" w:hanging="360"/>
+      </w:pPr>
+    </w:lvl>
+    <w:lvl w:ilvl="4" w:tplc="04090019" w:tentative="1">
+      <w:start w:val="1"/>
+      <w:numFmt w:val="lowerLetter"/>
+      <w:lvlText w:val="%5."/>
+      <w:lvlJc w:val="left"/>
+      <w:pPr>
+        <w:ind w:left="3600" w:hanging="360"/>
+      </w:pPr>
+    </w:lvl>
+    <w:lvl w:ilvl="5" w:tplc="0409001B" w:tentative="1">
+      <w:start w:val="1"/>
+      <w:numFmt w:val="lowerRoman"/>
+      <w:lvlText w:val="%6."/>
+      <w:lvlJc w:val="right"/>
+      <w:pPr>
+        <w:ind w:left="4320" w:hanging="180"/>
+      </w:pPr>
+    </w:lvl>
+    <w:lvl w:ilvl="6" w:tplc="0409000F" w:tentative="1">
+      <w:start w:val="1"/>
+      <w:numFmt w:val="decimal"/>
+      <w:lvlText w:val="%7."/>
+      <w:lvlJc w:val="left"/>
+      <w:pPr>
+        <w:ind w:left="5040" w:hanging="360"/>
+      </w:pPr>
+    </w:lvl>
+    <w:lvl w:ilvl="7" w:tplc="04090019" w:tentative="1">
+      <w:start w:val="1"/>
+      <w:numFmt w:val="lowerLetter"/>
+      <w:lvlText w:val="%8."/>
+      <w:lvlJc w:val="left"/>
+      <w:pPr>
+        <w:ind w:left="5760" w:hanging="360"/>
+      </w:pPr>
+    </w:lvl>
+    <w:lvl w:ilvl="8" w:tplc="0409001B" w:tentative="1">
+      <w:start w:val="1"/>
+      <w:numFmt w:val="lowerRoman"/>
+      <w:lvlText w:val="%9."/>
+      <w:lvlJc w:val="right"/>
+      <w:pPr>
+        <w:ind w:left="6480" w:hanging="180"/>
+      </w:pPr>
+    </w:lvl>
+  </w:abstractNum>
+  <w:abstractNum w:abstractNumId="6" w15:restartNumberingAfterBreak="0">
+    <w:nsid w:val="75DD709B"/>
+    <w:multiLevelType w:val="hybridMultilevel"/>
+    <w:tmpl w:val="929A8812"/>
+    <w:lvl w:ilvl="0" w:tplc="0409000F">
+      <w:start w:val="1"/>
+      <w:numFmt w:val="decimal"/>
+      <w:lvlText w:val="%1."/>
+      <w:lvlJc w:val="left"/>
+      <w:pPr>
+        <w:ind w:left="720" w:hanging="360"/>
+      </w:pPr>
+    </w:lvl>
+    <w:lvl w:ilvl="1" w:tplc="04090019">
+      <w:start w:val="1"/>
+      <w:numFmt w:val="lowerLetter"/>
+      <w:lvlText w:val="%2."/>
+      <w:lvlJc w:val="left"/>
+      <w:pPr>
+        <w:ind w:left="1440" w:hanging="360"/>
+      </w:pPr>
+    </w:lvl>
+    <w:lvl w:ilvl="2" w:tplc="0409001B" w:tentative="1">
+      <w:start w:val="1"/>
+      <w:numFmt w:val="lowerRoman"/>
+      <w:lvlText w:val="%3."/>
+      <w:lvlJc w:val="right"/>
+      <w:pPr>
+        <w:ind w:left="2160" w:hanging="180"/>
+      </w:pPr>
+    </w:lvl>
+    <w:lvl w:ilvl="3" w:tplc="0409000F" w:tentative="1">
+      <w:start w:val="1"/>
+      <w:numFmt w:val="decimal"/>
+      <w:lvlText w:val="%4."/>
+      <w:lvlJc w:val="left"/>
+      <w:pPr>
+        <w:ind w:left="2880" w:hanging="360"/>
+      </w:pPr>
+    </w:lvl>
+    <w:lvl w:ilvl="4" w:tplc="04090019" w:tentative="1">
+      <w:start w:val="1"/>
+      <w:numFmt w:val="lowerLetter"/>
+      <w:lvlText w:val="%5."/>
+      <w:lvlJc w:val="left"/>
+      <w:pPr>
+        <w:ind w:left="3600" w:hanging="360"/>
+      </w:pPr>
+    </w:lvl>
+    <w:lvl w:ilvl="5" w:tplc="0409001B" w:tentative="1">
+      <w:start w:val="1"/>
+      <w:numFmt w:val="lowerRoman"/>
+      <w:lvlText w:val="%6."/>
+      <w:lvlJc w:val="right"/>
+      <w:pPr>
+        <w:ind w:left="4320" w:hanging="180"/>
+      </w:pPr>
+    </w:lvl>
+    <w:lvl w:ilvl="6" w:tplc="0409000F" w:tentative="1">
+      <w:start w:val="1"/>
+      <w:numFmt w:val="decimal"/>
+      <w:lvlText w:val="%7."/>
+      <w:lvlJc w:val="left"/>
+      <w:pPr>
+        <w:ind w:left="5040" w:hanging="360"/>
+      </w:pPr>
+    </w:lvl>
+    <w:lvl w:ilvl="7" w:tplc="04090019" w:tentative="1">
+      <w:start w:val="1"/>
+      <w:numFmt w:val="lowerLetter"/>
+      <w:lvlText w:val="%8."/>
+      <w:lvlJc w:val="left"/>
+      <w:pPr>
+        <w:ind w:left="5760" w:hanging="360"/>
+      </w:pPr>
+    </w:lvl>
+    <w:lvl w:ilvl="8" w:tplc="0409001B" w:tentative="1">
+      <w:start w:val="1"/>
+      <w:numFmt w:val="lowerRoman"/>
+      <w:lvlText w:val="%9."/>
+      <w:lvlJc w:val="right"/>
+      <w:pPr>
+        <w:ind w:left="6480" w:hanging="180"/>
+      </w:pPr>
+    </w:lvl>
+  </w:abstractNum>
+  <w:abstractNum w:abstractNumId="7" w15:restartNumberingAfterBreak="0">
     <w:nsid w:val="7D642C3C"/>
     <w:multiLevelType w:val="hybridMultilevel"/>
     <w:tmpl w:val="687E15A8"/>
@@ -1170,7 +1484,7 @@
     </w:lvl>
   </w:abstractNum>
   <w:num w:numId="1" w16cid:durableId="1777284622">
-    <w:abstractNumId w:val="5"/>
+    <w:abstractNumId w:val="7"/>
   </w:num>
   <w:num w:numId="2" w16cid:durableId="1784884502">
     <w:abstractNumId w:val="3"/>
@@ -1186,6 +1500,12 @@
   </w:num>
   <w:num w:numId="6" w16cid:durableId="536822279">
     <w:abstractNumId w:val="2"/>
+  </w:num>
+  <w:num w:numId="7" w16cid:durableId="106588149">
+    <w:abstractNumId w:val="6"/>
+  </w:num>
+  <w:num w:numId="8" w16cid:durableId="966161868">
+    <w:abstractNumId w:val="5"/>
   </w:num>
 </w:numbering>
 </file>

</xml_diff>